<commit_message>
Fix Introduction: 14 controls verified, Uyar ref, structural controls
- Languages: EN/TR/FA/HE (was FR/Malay) — matches actual experiments
- p-threshold: p>0.10 (was p>0.30) — Turkish p=0.139
- Structural controls: 5 distinct (equal-length, random, within-surah
  shuffle, verse-count fingerprint, leave-one-out) — total 14 verified
- Uyar reference: proper format (was bracketed placeholder)
- Added 7 Zenodo references (Papers I-VII with DOIs)

14 = 4 Arabic + 1 Torah + 4 translations + 5 structural

Co-Authored-By: Claude Opus 4.6 (1M context) <noreply@anthropic.com>
</commit_message>
<xml_diff>
--- a/papers/d369_introduction_new_paper.docx
+++ b/papers/d369_introduction_new_paper.docx
@@ -391,7 +391,7 @@
         <w:ind w:firstLine="720"/>
       </w:pPr>
       <w:r>
-        <w:t>Fourteen control texts. We test the Quran against fourteen comparison texts: four classical Arabic texts (Sahih al-Bukhari, Ibn Arabi’s Futuhat al-Makkiyya, the pre-Islamic Mu’allaqat, and the Quran with shuffled word order), the Hebrew Torah (in original Hebrew with standard gematria), four translations of the Quran (English, Turkish, Persian, and Hebrew, each tested under its own Abjad-equivalent mapping), and four additional structural controls (equal-length partitions, random partitions, verse-count analysis, and leave-one-out tests). No control text, in any language, shows the pattern.</w:t>
+        <w:t>Fourteen control texts. We test the Quran against fourteen comparison texts: four classical Arabic texts (Sahih al-Bukhari, Ibn Arabi’s Futuhat al-Makkiyya, the pre-Islamic Mu’allaqat, and the Quran with shuffled word order), the Hebrew Torah (in original Hebrew with standard gematria), four translations of the Quran (English, Turkish, Persian, and Hebrew, each tested under its own Abjad-equivalent mapping), and five additional structural controls (equal-length partitions, random partitions, within-Surah word shuffle, verse-count fingerprint, and leave-one-out analysis). No control text, in any language, shows the pattern.</w:t>
       </w:r>
     </w:p>
     <w:p>
@@ -681,12 +681,7 @@
         <w:ind/>
       </w:pPr>
       <w:r>
-        <w:rPr>
-          <w:rFonts w:ascii="Times New Roman" w:cs="Times New Roman" w:eastAsia="Times New Roman" w:hAnsi="Times New Roman"/>
-          <w:sz w:val="24"/>
-          <w:szCs w:val="24"/>
-        </w:rPr>
-        <w:t xml:space="preserve">Uyar, M. (2025). [Compiled numerical regularities in the Quran without inferential statistics.]</w:t>
+        <w:t>Uyar, M. (2025). Numerical Regularities in the Quran: A Descriptive Compilation. Unpublished manuscript.</w:t>
       </w:r>
     </w:p>
     <w:p>

</xml_diff>